<commit_message>
docs: trim to essentials
Cut redundancy that accumulated while the features landed. No behaviour
change; the substance each doc is judged on stays.

- README: fold the duplicate "Running it" section into Quick start (the
  URLs appeared three times), compress the bonus-features walkthrough,
  push alternate run modes behind a <details>. 179 -> 135 lines.
- API_EXAMPLES: drop reference sections that now duplicate the README,
  merge the profile/password and list/track steps, trim response blobs to
  the fields that carry a point. 369 -> 171 lines.
- WRITEUP: tighten throughout; 1373 -> 1267 words (~1.82 pages), leaving
  margin under the brief's 2-page limit.
- CLAUDE.md: drop the claim that the .NET references are "a leftover from
  a .NET template" — that was never confirmed, and README/WRITEUP had
  already stopped asserting it. Add the compose hostname-override gotcha.

Co-Authored-By: Claude Opus 4.8 <noreply@anthropic.com>
</commit_message>
<xml_diff>
--- a/WRITEUP.docx
+++ b/WRITEUP.docx
@@ -70,14 +70,6 @@
       </w:r>
     </w:p>
     <w:p>
-      <w:r>
-        <w:rPr>
-          <w:sz w:val="20"/>
-        </w:rPr>
-        <w:t xml:space="preserve">The four layers:</w:t>
-      </w:r>
-    </w:p>
-    <w:p>
       <w:pPr>
         <w:pStyle w:val="ListParagraph"/>
         <w:numPr>
@@ -156,7 +148,7 @@
         <w:rPr>
           <w:sz w:val="20"/>
         </w:rPr>
-        <w:t xml:space="preserve">, DTOs, Zod validators, and outbound </w:t>
+        <w:t xml:space="preserve">, DTOs, Zod validators, email templates, and outbound </w:t>
       </w:r>
       <w:r>
         <w:rPr>
@@ -294,19 +286,7 @@
         <w:rPr>
           <w:sz w:val="20"/>
         </w:rPr>
-        <w:t xml:space="preserve"> (</w:t>
-      </w:r>
-      <w:r>
-        <w:rPr>
-          <w:rStyle w:val="CodeChar"/>
-        </w:rPr>
-        <w:t xml:space="preserve">container.ts</w:t>
-      </w:r>
-      <w:r>
-        <w:rPr>
-          <w:sz w:val="20"/>
-        </w:rPr>
-        <w:t xml:space="preserve">) wires interfaces to implementations with </w:t>
+        <w:t xml:space="preserve"> wires interfaces to implementations with </w:t>
       </w:r>
       <w:r>
         <w:rPr>
@@ -403,7 +383,7 @@
         <w:rPr>
           <w:sz w:val="20"/>
         </w:rPr>
-        <w:t xml:space="preserve"> for structured logging. The brief's </w:t>
+        <w:t xml:space="preserve"> for structured logging. </w:t>
       </w:r>
       <w:r>
         <w:rPr>
@@ -416,7 +396,7 @@
         <w:rPr>
           <w:sz w:val="20"/>
         </w:rPr>
-        <w:t xml:space="preserve"> requirement is a language-agnostic principle rather than a .NET tool; I implemented it with </w:t>
+        <w:t xml:space="preserve"> is a language-agnostic principle rather than a .NET tool; I implemented it with </w:t>
       </w:r>
       <w:r>
         <w:rPr>
@@ -463,7 +443,7 @@
         <w:rPr>
           <w:sz w:val="20"/>
         </w:rPr>
-        <w:t xml:space="preserve"> with hand-built layers (rather than a batteries-included framework) so the Clean-Architecture structure is explicit; </w:t>
+        <w:t xml:space="preserve"> with hand-built layers so the Clean-Architecture structure stays explicit; </w:t>
       </w:r>
       <w:r>
         <w:rPr>
@@ -476,7 +456,7 @@
         <w:rPr>
           <w:sz w:val="20"/>
         </w:rPr>
-        <w:t xml:space="preserve"> for boundary validation; and </w:t>
+        <w:t xml:space="preserve"> for boundary validation; </w:t>
       </w:r>
       <w:r>
         <w:rPr>
@@ -501,7 +481,7 @@
         <w:rPr>
           <w:sz w:val="20"/>
         </w:rPr>
-        <w:t xml:space="preserve"> entity was introduced so orders reference real line items and totals are computed server-side rather than trusted from the client.</w:t>
+        <w:t xml:space="preserve"> entity was added so orders reference real line items and totals are computed server-side rather than trusted from the client.</w:t>
       </w:r>
     </w:p>
     <w:p>
@@ -586,13 +566,13 @@
           <w:b/>
           <w:sz w:val="20"/>
         </w:rPr>
-        <w:t xml:space="preserve">Global error handling, and no 500 the client can cause.</w:t>
-      </w:r>
-      <w:r>
-        <w:rPr>
-          <w:sz w:val="20"/>
-        </w:rPr>
-        <w:t xml:space="preserve"> A custom </w:t>
+        <w:t xml:space="preserve">Global error handling, and no 500 a client can cause.</w:t>
+      </w:r>
+      <w:r>
+        <w:rPr>
+          <w:sz w:val="20"/>
+        </w:rPr>
+        <w:t xml:space="preserve"> An </w:t>
       </w:r>
       <w:r>
         <w:rPr>
@@ -604,7 +584,7 @@
         <w:rPr>
           <w:sz w:val="20"/>
         </w:rPr>
-        <w:t xml:space="preserve"> hierarchy carries HTTP status codes; one middleware maps them to consistent JSON responses. A </w:t>
+        <w:t xml:space="preserve"> hierarchy carries HTTP status codes and one middleware maps them to consistent JSON. A </w:t>
       </w:r>
       <w:r>
         <w:rPr>
@@ -640,7 +620,7 @@
         <w:rPr>
           <w:sz w:val="20"/>
         </w:rPr>
-        <w:t xml:space="preserve"> rather than letting them fall through. Unexpected errors are logged and returned as a generic 500 so internals never leak.</w:t>
+        <w:t xml:space="preserve"> rather than letting them fall through to a server error. Unexpected errors are logged and returned as a generic 500 so internals never leak.</w:t>
       </w:r>
     </w:p>
     <w:p>
@@ -702,69 +682,35 @@
           <w:b/>
           <w:sz w:val="20"/>
         </w:rPr>
+        <w:t xml:space="preserve">Deactivation takes effect immediately.</w:t>
+      </w:r>
+      <w:r>
+        <w:rPr>
+          <w:sz w:val="20"/>
+        </w:rPr>
+        <w:t xml:space="preserve"> A JWT outlives the account it was signed for, so verifying the signature isn't enough: the auth middleware also confirms the subject still resolves to a live, active customer. Without it, deactivating an account would leave the customer a fully working token until it expired. The check reads through the profile cache — already invalidated on deactivate/delete — so on a warm cache it costs no extra query.</w:t>
+      </w:r>
+    </w:p>
+    <w:p>
+      <w:pPr>
+        <w:pStyle w:val="ListParagraph"/>
+        <w:numPr>
+          <w:ilvl w:val="0"/>
+          <w:numId w:val="1"/>
+        </w:numPr>
+      </w:pPr>
+      <w:r>
+        <w:rPr>
+          <w:b/>
+          <w:sz w:val="20"/>
+        </w:rPr>
         <w:t xml:space="preserve">Security.</w:t>
       </w:r>
       <w:r>
         <w:rPr>
           <w:sz w:val="20"/>
         </w:rPr>
-        <w:t xml:space="preserve"> Passwords are bcrypt-hashed; login returns a uniform "Invalid credentials" message to avoid user enumeration; JWTs carry the role for authorization; Helmet, CORS, and rate-limiting protect the surface.</w:t>
-      </w:r>
-    </w:p>
-    <w:p>
-      <w:pPr>
-        <w:pStyle w:val="ListParagraph"/>
-        <w:numPr>
-          <w:ilvl w:val="0"/>
-          <w:numId w:val="1"/>
-        </w:numPr>
-      </w:pPr>
-      <w:r>
-        <w:rPr>
-          <w:b/>
-          <w:sz w:val="20"/>
-        </w:rPr>
-        <w:t xml:space="preserve">Deactivation takes effect immediately.</w:t>
-      </w:r>
-      <w:r>
-        <w:rPr>
-          <w:sz w:val="20"/>
-        </w:rPr>
-        <w:t xml:space="preserve"> A JWT outlives the account it was signed for, so verifying the signature isn't enough: the auth middleware also confirms the subject still resolves to a live, active customer. Without it, deactivating an account would leave the customer with a fully working token until it expired. The check reads through the profile cache — already invalidated on deactivate/delete — so on a warm cache it costs no extra query.</w:t>
-      </w:r>
-    </w:p>
-    <w:p>
-      <w:pPr>
-        <w:pStyle w:val="ListParagraph"/>
-        <w:numPr>
-          <w:ilvl w:val="0"/>
-          <w:numId w:val="1"/>
-        </w:numPr>
-      </w:pPr>
-      <w:r>
-        <w:rPr>
-          <w:b/>
-          <w:sz w:val="20"/>
-        </w:rPr>
-        <w:t xml:space="preserve">Input is validated on meaning, not shape.</w:t>
-      </w:r>
-      <w:r>
-        <w:rPr>
-          <w:sz w:val="20"/>
-        </w:rPr>
-        <w:t xml:space="preserve"> Phone numbers are checked on the digits they carry (7–15, per E.164) rather than their punctuation, so real formats like </w:t>
-      </w:r>
-      <w:r>
-        <w:rPr>
-          <w:rStyle w:val="CodeChar"/>
-        </w:rPr>
-        <w:t xml:space="preserve">+60 12-345 6789</w:t>
-      </w:r>
-      <w:r>
-        <w:rPr>
-          <w:sz w:val="20"/>
-        </w:rPr>
-        <w:t xml:space="preserve"> are accepted while nonsense is rejected. An order may list a product only once, so quantities can't be split across duplicate lines. Bodies are strict: an unknown field is a 422 rather than an ignored key, so a typo — or a hopeful </w:t>
+        <w:t xml:space="preserve"> Passwords are bcrypt-hashed; login returns a uniform "Invalid credentials" message to avoid user enumeration; JWTs carry the role for authorization; Helmet, CORS and rate-limiting protect the surface. Bodies are strict, so a hopeful </w:t>
       </w:r>
       <w:r>
         <w:rPr>
@@ -776,7 +722,7 @@
         <w:rPr>
           <w:sz w:val="20"/>
         </w:rPr>
-        <w:t xml:space="preserve"> on register — gets a straight answer instead of a 201 that quietly dropped it.</w:t>
+        <w:t xml:space="preserve"> on register is rejected rather than quietly ignored.</w:t>
       </w:r>
     </w:p>
     <w:p>
@@ -810,7 +756,7 @@
         <w:rPr>
           <w:sz w:val="20"/>
         </w:rPr>
-        <w:t xml:space="preserve"> is set. I exposed no log endpoint: logs carry customer emails and login events, so serving them over the API would turn an operations concern into an information-disclosure risk. An optional Compose profile wires in a log viewer instead.</w:t>
+        <w:t xml:space="preserve"> is set. I exposed no log endpoint: logs carry customer emails and login events, so serving them over the API would turn an operations concern into an information-disclosure risk. A container log viewer covers the need instead.</w:t>
       </w:r>
     </w:p>
     <w:p>
@@ -1023,15 +969,15 @@
         <w:rPr>
           <w:sz w:val="20"/>
         </w:rPr>
-        <w:t xml:space="preserve"> wired to in-memory repositories through the production DI tokens — no database required — covering auth, profile and password flows, input validation, the order lifecycle rules, ownership checks, pagination, and role-based authorization.</w:t>
-      </w:r>
-    </w:p>
-    <w:p>
-      <w:r>
-        <w:rPr>
-          <w:sz w:val="20"/>
-        </w:rPr>
-        <w:t xml:space="preserve">That suite deliberately swaps the database out, so it can't vouch for the persistence layer — and a console email driver proves nothing about SMTP. Both are verified by running the whole stack under Docker: migrations applying to an empty database, the decimal transformer returning real numbers, the foreign-key cascade when a customer with orders is deleted, and the order emails genuinely arriving in a real inbox (Compose starts a Mailpit SMTP server alongside the API, so a reviewer can watch them land). Knowing which claims a given test can and cannot support is the point.</w:t>
+        <w:t xml:space="preserve"> wired to in-memory repositories through the production DI tokens — no database required — covering auth, profile and password flows, validation, the order lifecycle, ownership, pagination and role-based authorization.</w:t>
+      </w:r>
+    </w:p>
+    <w:p>
+      <w:r>
+        <w:rPr>
+          <w:sz w:val="20"/>
+        </w:rPr>
+        <w:t xml:space="preserve">That suite deliberately swaps the database out, so it can't vouch for the persistence layer, and a console email driver proves nothing about SMTP. Both are verified by running the whole stack under Docker: migrations applying to an empty database, the decimal transformer returning real numbers, the foreign-key cascade when a customer with orders is deleted, and the order emails genuinely arriving in a real inbox. Knowing which claims a given test can and cannot support is the point.</w:t>
       </w:r>
     </w:p>
     <w:p>

</xml_diff>